<commit_message>
Updated stim at specific chan
</commit_message>
<xml_diff>
--- a/Spike_Config_FINALE/Extra/Patec_ReadMe.docx
+++ b/Spike_Config_FINALE/Extra/Patec_ReadMe.docx
@@ -4952,7 +4952,49 @@
           <w:color w:val="FF0000"/>
           <w:lang w:val="en-US"/>
         </w:rPr>
-        <w:t xml:space="preserve"> is currently in development. It works so far however is not perfectly implement with XY width and snippet because a double loop dual condition in assembly is quite hard to make. In a nutshell, </w:t>
+        <w:t xml:space="preserve"> is currently in development. It works so far however is </w:t>
+      </w:r>
+      <w:r>
+        <w:rPr>
+          <w:color w:val="FF0000"/>
+          <w:lang w:val="en-US"/>
+        </w:rPr>
+        <w:t xml:space="preserve">not </w:t>
+      </w:r>
+      <w:r>
+        <w:rPr>
+          <w:color w:val="FF0000"/>
+          <w:lang w:val="en-US"/>
+        </w:rPr>
+        <w:t xml:space="preserve">perfectly implement with </w:t>
+      </w:r>
+      <w:r>
+        <w:rPr>
+          <w:color w:val="FF0000"/>
+          <w:lang w:val="en-US"/>
+        </w:rPr>
+        <w:t>the two rotations as I should more conditions in the sequencer</w:t>
+      </w:r>
+      <w:r>
+        <w:rPr>
+          <w:color w:val="FF0000"/>
+          <w:lang w:val="en-US"/>
+        </w:rPr>
+        <w:t xml:space="preserve">. </w:t>
+      </w:r>
+      <w:r>
+        <w:rPr>
+          <w:color w:val="FF0000"/>
+          <w:lang w:val="en-US"/>
+        </w:rPr>
+        <w:t>However, i</w:t>
+      </w:r>
+      <w:r>
+        <w:rPr>
+          <w:color w:val="FF0000"/>
+          <w:lang w:val="en-US"/>
+        </w:rPr>
+        <w:t xml:space="preserve">n a nutshell, </w:t>
       </w:r>
       <w:proofErr w:type="spellStart"/>
       <w:r>
@@ -4968,50 +5010,96 @@
           <w:color w:val="FF0000"/>
           <w:lang w:val="en-US"/>
         </w:rPr>
-        <w:t xml:space="preserve"> you change the value and/or the channel to use, the sequencer is opened as a text file in the background, a function looks for specific “CHAN” position and change the value with the one corresponding to the selected channels. While the value </w:t>
+        <w:t xml:space="preserve"> you change the value and/or the channel to use, the sequencer is opened as a text file in the background, a function looks for specific “CHAN” position and change the value with the one corresponding to the selected channel. While the value to check is converted back to 16bit integer (</w:t>
       </w:r>
       <w:r>
         <w:rPr>
           <w:color w:val="FF0000"/>
           <w:lang w:val="en-US"/>
         </w:rPr>
+        <w:t>+32767 to -32768)</w:t>
+      </w:r>
+      <w:r>
+        <w:rPr>
+          <w:color w:val="FF0000"/>
+          <w:lang w:val="en-US"/>
+        </w:rPr>
+        <w:t xml:space="preserve"> with a threshold of +-7bits</w:t>
+      </w:r>
+      <w:r>
+        <w:rPr>
+          <w:color w:val="FF0000"/>
+          <w:lang w:val="en-US"/>
+        </w:rPr>
+        <w:t xml:space="preserve">, and pass as a variable </w:t>
+      </w:r>
+      <w:r>
+        <w:rPr>
+          <w:color w:val="FF0000"/>
+          <w:lang w:val="en-US"/>
+        </w:rPr>
         <w:lastRenderedPageBreak/>
-        <w:t>to check is converted back to 16bit integer (</w:t>
+        <w:t>to the sequencer</w:t>
       </w:r>
       <w:r>
         <w:rPr>
           <w:color w:val="FF0000"/>
           <w:lang w:val="en-US"/>
         </w:rPr>
-        <w:t>+32767 to -32768)</w:t>
+        <w:t>.</w:t>
       </w:r>
       <w:r>
         <w:rPr>
           <w:color w:val="FF0000"/>
           <w:lang w:val="en-US"/>
         </w:rPr>
-        <w:t xml:space="preserve"> with a threshold of +-7bits</w:t>
+        <w:t xml:space="preserve"> The pulse lasts 1ms!</w:t>
       </w:r>
       <w:r>
         <w:rPr>
           <w:color w:val="FF0000"/>
           <w:lang w:val="en-US"/>
         </w:rPr>
-        <w:t>, and pass as a variable to the sequencer</w:t>
+        <w:t xml:space="preserve"> </w:t>
       </w:r>
       <w:r>
         <w:rPr>
           <w:color w:val="FF0000"/>
           <w:lang w:val="en-US"/>
         </w:rPr>
-        <w:t>.</w:t>
-      </w:r>
+        <w:t xml:space="preserve">So far it works without any rotations or with 2 rotations (adaptable to the time set in </w:t>
+      </w:r>
+      <w:proofErr w:type="spellStart"/>
       <w:r>
         <w:rPr>
           <w:color w:val="FF0000"/>
           <w:lang w:val="en-US"/>
         </w:rPr>
-        <w:t xml:space="preserve"> The pulse lasts 1ms!</w:t>
+        <w:t>isomed</w:t>
+      </w:r>
+      <w:proofErr w:type="spellEnd"/>
+      <w:r>
+        <w:rPr>
+          <w:color w:val="FF0000"/>
+          <w:lang w:val="en-US"/>
+        </w:rPr>
+        <w:t xml:space="preserve"> rot). The control/check occur after the first rotation.</w:t>
+      </w:r>
+    </w:p>
+    <w:p>
+      <w:pPr>
+        <w:jc w:val="both"/>
+        <w:rPr>
+          <w:color w:val="FF0000"/>
+          <w:lang w:val="en-US"/>
+        </w:rPr>
+      </w:pPr>
+      <w:r>
+        <w:rPr>
+          <w:color w:val="FF0000"/>
+          <w:lang w:val="en-US"/>
+        </w:rPr>
+        <w:t>BE AWARE, IF YOUR CONFIG FILE HAS NO WAVEFORM CHANNEL, IT WILL CRASH. EVEN IF THE SEQUENCER LETTER OF WITH THE SPECIFIC INSTRUCTION HAS BEEN SENT, probably a safety mechanism.</w:t>
       </w:r>
     </w:p>
     <w:p>
@@ -6027,6 +6115,7 @@
           <w:iCs/>
           <w:lang w:val="en-US"/>
         </w:rPr>
+        <w:lastRenderedPageBreak/>
         <w:t>Hand draw:</w:t>
       </w:r>
       <w:r>
@@ -6094,7 +6183,6 @@
           <w:iCs/>
           <w:lang w:val="en-US"/>
         </w:rPr>
-        <w:lastRenderedPageBreak/>
         <w:t>Simple Ramp:</w:t>
       </w:r>
       <w:r>
@@ -7055,7 +7143,14 @@
         <w:rPr>
           <w:lang w:val="en-US"/>
         </w:rPr>
-        <w:t xml:space="preserve"> starts recording after 1.2s…you lost 0.7s of information that is not baseline.</w:t>
+        <w:t xml:space="preserve"> starts recording after 1.2s…you lost 0.7s of </w:t>
+      </w:r>
+      <w:r>
+        <w:rPr>
+          <w:lang w:val="en-US"/>
+        </w:rPr>
+        <w:lastRenderedPageBreak/>
+        <w:t>information that is not baseline.</w:t>
       </w:r>
       <w:r>
         <w:rPr>
@@ -7100,7 +7195,6 @@
           <w:bCs/>
           <w:lang w:val="en-US"/>
         </w:rPr>
-        <w:lastRenderedPageBreak/>
         <w:t xml:space="preserve">BE sure that at line 203 and 703, the path to EchoWaveCMD.exe is correct, otherwise it won’t control </w:t>
       </w:r>
       <w:proofErr w:type="spellStart"/>
@@ -7213,7 +7307,7 @@
               </wp:anchor>
             </w:drawing>
           </mc:Choice>
-          <mc:Fallback xmlns:oel="http://schemas.microsoft.com/office/2019/extlst" xmlns:w16du="http://schemas.microsoft.com/office/word/2023/wordml/word16du" xmlns:w16sdtfl="http://schemas.microsoft.com/office/word/2024/wordml/sdtformatlock">
+          <mc:Fallback xmlns:w16sdtfl="http://schemas.microsoft.com/office/word/2024/wordml/sdtformatlock" xmlns:w16du="http://schemas.microsoft.com/office/word/2023/wordml/word16du" xmlns:oel="http://schemas.microsoft.com/office/2019/extlst">
             <w:pict>
               <v:shapetype w14:anchorId="2550376A" id="_x0000_t75" coordsize="21600,21600" o:spt="75" o:preferrelative="t" path="m@4@5l@4@11@9@11@9@5xe" filled="f" stroked="f">
                 <v:stroke joinstyle="miter"/>
@@ -7280,7 +7374,7 @@
               </wp:anchor>
             </w:drawing>
           </mc:Choice>
-          <mc:Fallback xmlns:oel="http://schemas.microsoft.com/office/2019/extlst" xmlns:w16du="http://schemas.microsoft.com/office/word/2023/wordml/word16du" xmlns:w16sdtfl="http://schemas.microsoft.com/office/word/2024/wordml/sdtformatlock">
+          <mc:Fallback xmlns:w16sdtfl="http://schemas.microsoft.com/office/word/2024/wordml/sdtformatlock" xmlns:w16du="http://schemas.microsoft.com/office/word/2023/wordml/word16du" xmlns:oel="http://schemas.microsoft.com/office/2019/extlst">
             <w:pict>
               <v:shape w14:anchorId="068330FF" id="Ink 22" o:spid="_x0000_s1026" type="#_x0000_t75" style="position:absolute;margin-left:253.65pt;margin-top:141.35pt;width:29.2pt;height:19.5pt;z-index:251671552;visibility:visible;mso-wrap-style:square;mso-wrap-distance-left:9pt;mso-wrap-distance-top:0;mso-wrap-distance-right:9pt;mso-wrap-distance-bottom:0;mso-position-horizontal:absolute;mso-position-horizontal-relative:text;mso-position-vertical:absolute;mso-position-vertical-relative:text" o:gfxdata="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">
                 <v:imagedata r:id="rId26" o:title=""/>
@@ -7328,7 +7422,7 @@
               </wp:anchor>
             </w:drawing>
           </mc:Choice>
-          <mc:Fallback xmlns:oel="http://schemas.microsoft.com/office/2019/extlst" xmlns:w16du="http://schemas.microsoft.com/office/word/2023/wordml/word16du" xmlns:w16sdtfl="http://schemas.microsoft.com/office/word/2024/wordml/sdtformatlock">
+          <mc:Fallback xmlns:w16sdtfl="http://schemas.microsoft.com/office/word/2024/wordml/sdtformatlock" xmlns:w16du="http://schemas.microsoft.com/office/word/2023/wordml/word16du" xmlns:oel="http://schemas.microsoft.com/office/2019/extlst">
             <w:pict>
               <v:shape w14:anchorId="3F18EBBE" id="Ink 18" o:spid="_x0000_s1026" type="#_x0000_t75" style="position:absolute;margin-left:42.4pt;margin-top:135.75pt;width:10.45pt;height:1.75pt;z-index:251667456;visibility:visible;mso-wrap-style:square;mso-wrap-distance-left:9pt;mso-wrap-distance-top:0;mso-wrap-distance-right:9pt;mso-wrap-distance-bottom:0;mso-position-horizontal:absolute;mso-position-horizontal-relative:text;mso-position-vertical:absolute;mso-position-vertical-relative:text" o:gfxdata="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">
                 <v:imagedata r:id="rId28" o:title=""/>
@@ -7432,7 +7526,7 @@
               </wp:anchor>
             </w:drawing>
           </mc:Choice>
-          <mc:Fallback xmlns:oel="http://schemas.microsoft.com/office/2019/extlst" xmlns:w16du="http://schemas.microsoft.com/office/word/2023/wordml/word16du" xmlns:w16sdtfl="http://schemas.microsoft.com/office/word/2024/wordml/sdtformatlock">
+          <mc:Fallback xmlns:w16sdtfl="http://schemas.microsoft.com/office/word/2024/wordml/sdtformatlock" xmlns:w16du="http://schemas.microsoft.com/office/word/2023/wordml/word16du" xmlns:oel="http://schemas.microsoft.com/office/2019/extlst">
             <w:pict>
               <v:shape w14:anchorId="3C685ECC" id="Ink 34" o:spid="_x0000_s1026" type="#_x0000_t75" style="position:absolute;margin-left:235.75pt;margin-top:169.3pt;width:8.25pt;height:1.45pt;z-index:251678720;visibility:visible;mso-wrap-style:square;mso-wrap-distance-left:9pt;mso-wrap-distance-top:0;mso-wrap-distance-right:9pt;mso-wrap-distance-bottom:0;mso-position-horizontal:absolute;mso-position-horizontal-relative:text;mso-position-vertical:absolute;mso-position-vertical-relative:text" o:gfxdata="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">
                 <v:imagedata r:id="rId31" o:title=""/>
@@ -7478,7 +7572,7 @@
               </wp:anchor>
             </w:drawing>
           </mc:Choice>
-          <mc:Fallback xmlns:oel="http://schemas.microsoft.com/office/2019/extlst" xmlns:w16du="http://schemas.microsoft.com/office/word/2023/wordml/word16du" xmlns:w16sdtfl="http://schemas.microsoft.com/office/word/2024/wordml/sdtformatlock">
+          <mc:Fallback xmlns:w16sdtfl="http://schemas.microsoft.com/office/word/2024/wordml/sdtformatlock" xmlns:w16du="http://schemas.microsoft.com/office/word/2023/wordml/word16du" xmlns:oel="http://schemas.microsoft.com/office/2019/extlst">
             <w:pict>
               <v:shape w14:anchorId="35AC776B" id="Ink 30" o:spid="_x0000_s1026" type="#_x0000_t75" style="position:absolute;margin-left:234.5pt;margin-top:169.65pt;width:25.85pt;height:12.1pt;z-index:251677696;visibility:visible;mso-wrap-style:square;mso-wrap-distance-left:9pt;mso-wrap-distance-top:0;mso-wrap-distance-right:9pt;mso-wrap-distance-bottom:0;mso-position-horizontal:absolute;mso-position-horizontal-relative:text;mso-position-vertical:absolute;mso-position-vertical-relative:text" o:gfxdata="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">
                 <v:imagedata r:id="rId33" o:title=""/>
@@ -7524,7 +7618,7 @@
               </wp:anchor>
             </w:drawing>
           </mc:Choice>
-          <mc:Fallback xmlns:oel="http://schemas.microsoft.com/office/2019/extlst" xmlns:w16du="http://schemas.microsoft.com/office/word/2023/wordml/word16du" xmlns:w16sdtfl="http://schemas.microsoft.com/office/word/2024/wordml/sdtformatlock">
+          <mc:Fallback xmlns:w16sdtfl="http://schemas.microsoft.com/office/word/2024/wordml/sdtformatlock" xmlns:w16du="http://schemas.microsoft.com/office/word/2023/wordml/word16du" xmlns:oel="http://schemas.microsoft.com/office/2019/extlst">
             <w:pict>
               <v:shape w14:anchorId="0A7FDE98" id="Ink 27" o:spid="_x0000_s1026" type="#_x0000_t75" style="position:absolute;margin-left:119.4pt;margin-top:163.55pt;width:112.75pt;height:4pt;z-index:251674624;visibility:visible;mso-wrap-style:square;mso-wrap-distance-left:9pt;mso-wrap-distance-top:0;mso-wrap-distance-right:9pt;mso-wrap-distance-bottom:0;mso-position-horizontal:absolute;mso-position-horizontal-relative:text;mso-position-vertical:absolute;mso-position-vertical-relative:text" o:gfxdata="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">
                 <v:imagedata r:id="rId35" o:title=""/>
@@ -7570,7 +7664,7 @@
               </wp:anchor>
             </w:drawing>
           </mc:Choice>
-          <mc:Fallback xmlns:oel="http://schemas.microsoft.com/office/2019/extlst" xmlns:w16du="http://schemas.microsoft.com/office/word/2023/wordml/word16du" xmlns:w16sdtfl="http://schemas.microsoft.com/office/word/2024/wordml/sdtformatlock">
+          <mc:Fallback xmlns:w16sdtfl="http://schemas.microsoft.com/office/word/2024/wordml/sdtformatlock" xmlns:w16du="http://schemas.microsoft.com/office/word/2023/wordml/word16du" xmlns:oel="http://schemas.microsoft.com/office/2019/extlst">
             <w:pict>
               <v:shape w14:anchorId="7A87FA14" id="Ink 26" o:spid="_x0000_s1026" type="#_x0000_t75" style="position:absolute;margin-left:42.95pt;margin-top:163.1pt;width:8.55pt;height:1.45pt;z-index:251673600;visibility:visible;mso-wrap-style:square;mso-wrap-distance-left:9pt;mso-wrap-distance-top:0;mso-wrap-distance-right:9pt;mso-wrap-distance-bottom:0;mso-position-horizontal:absolute;mso-position-horizontal-relative:text;mso-position-vertical:absolute;mso-position-vertical-relative:text" o:gfxdata="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">
                 <v:imagedata r:id="rId37" o:title=""/>
@@ -8151,6 +8245,7 @@
           <w:bCs/>
           <w:lang w:val="en-US"/>
         </w:rPr>
+        <w:lastRenderedPageBreak/>
         <w:t xml:space="preserve">DAC 1 TTL (to triggering any external system) </w:t>
       </w:r>
       <w:r>
@@ -8257,7 +8352,6 @@
         <w:rPr>
           <w:lang w:val="en-US"/>
         </w:rPr>
-        <w:lastRenderedPageBreak/>
         <w:t xml:space="preserve">INFO: DAC1 </w:t>
       </w:r>
       <w:r>
@@ -8812,6 +8906,7 @@
         <w:rPr>
           <w:lang w:val="en-US"/>
         </w:rPr>
+        <w:lastRenderedPageBreak/>
         <w:t>Un/Freeze US</w:t>
       </w:r>
       <w:r>
@@ -8865,7 +8960,7 @@
               </wp:anchor>
             </w:drawing>
           </mc:Choice>
-          <mc:Fallback xmlns:oel="http://schemas.microsoft.com/office/2019/extlst" xmlns:w16du="http://schemas.microsoft.com/office/word/2023/wordml/word16du" xmlns:w16sdtfl="http://schemas.microsoft.com/office/word/2024/wordml/sdtformatlock">
+          <mc:Fallback xmlns:w16sdtfl="http://schemas.microsoft.com/office/word/2024/wordml/sdtformatlock" xmlns:w16du="http://schemas.microsoft.com/office/word/2023/wordml/word16du" xmlns:oel="http://schemas.microsoft.com/office/2019/extlst">
             <w:pict>
               <v:shapetype w14:anchorId="0C19D508" id="_x0000_t75" coordsize="21600,21600" o:spt="75" o:preferrelative="t" path="m@4@5l@4@11@9@11@9@5xe" filled="f" stroked="f">
                 <v:stroke joinstyle="miter"/>
@@ -8930,7 +9025,7 @@
               </wp:anchor>
             </w:drawing>
           </mc:Choice>
-          <mc:Fallback xmlns:oel="http://schemas.microsoft.com/office/2019/extlst" xmlns:w16du="http://schemas.microsoft.com/office/word/2023/wordml/word16du" xmlns:w16sdtfl="http://schemas.microsoft.com/office/word/2024/wordml/sdtformatlock">
+          <mc:Fallback xmlns:w16sdtfl="http://schemas.microsoft.com/office/word/2024/wordml/sdtformatlock" xmlns:w16du="http://schemas.microsoft.com/office/word/2023/wordml/word16du" xmlns:oel="http://schemas.microsoft.com/office/2019/extlst">
             <w:pict>
               <v:shape w14:anchorId="487D434F" id="Ink 36" o:spid="_x0000_s1026" type="#_x0000_t75" style="position:absolute;margin-left:10.4pt;margin-top:74.85pt;width:14.25pt;height:1.45pt;z-index:251680768;visibility:visible;mso-wrap-style:square;mso-wrap-distance-left:9pt;mso-wrap-distance-top:0;mso-wrap-distance-right:9pt;mso-wrap-distance-bottom:0;mso-position-horizontal:absolute;mso-position-horizontal-relative:text;mso-position-vertical:absolute;mso-position-vertical-relative:text" o:gfxdata="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">
                 <v:imagedata r:id="rId42" o:title=""/>
@@ -9037,7 +9132,7 @@
               </wp:anchor>
             </w:drawing>
           </mc:Choice>
-          <mc:Fallback xmlns:oel="http://schemas.microsoft.com/office/2019/extlst" xmlns:w16du="http://schemas.microsoft.com/office/word/2023/wordml/word16du" xmlns:w16sdtfl="http://schemas.microsoft.com/office/word/2024/wordml/sdtformatlock">
+          <mc:Fallback xmlns:w16sdtfl="http://schemas.microsoft.com/office/word/2024/wordml/sdtformatlock" xmlns:w16du="http://schemas.microsoft.com/office/word/2023/wordml/word16du" xmlns:oel="http://schemas.microsoft.com/office/2019/extlst">
             <w:pict>
               <v:shape w14:anchorId="2B8A1CCF" id="Ink 42" o:spid="_x0000_s1026" type="#_x0000_t75" style="position:absolute;margin-left:287.8pt;margin-top:78.1pt;width:33.85pt;height:18.85pt;z-index:251686912;visibility:visible;mso-wrap-style:square;mso-wrap-distance-left:9pt;mso-wrap-distance-top:0;mso-wrap-distance-right:9pt;mso-wrap-distance-bottom:0;mso-position-horizontal:absolute;mso-position-horizontal-relative:text;mso-position-vertical:absolute;mso-position-vertical-relative:text" o:gfxdata="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">
                 <v:imagedata r:id="rId45" o:title=""/>
@@ -10029,7 +10124,7 @@
       <w:rPr>
         <w:i/>
         <w:iCs/>
-        <w:lang w:val="it-IT"/>
+        <w:lang w:val="en-US"/>
       </w:rPr>
       <w:t>2</w:t>
     </w:r>
@@ -10037,10 +10132,18 @@
       <w:rPr>
         <w:i/>
         <w:iCs/>
+        <w:lang w:val="en-US"/>
+      </w:rPr>
+      <w:t>5</w:t>
+    </w:r>
+    <w:r>
+      <w:rPr>
+        <w:i/>
+        <w:iCs/>
         <w:vertAlign w:val="superscript"/>
-        <w:lang w:val="it-IT"/>
+        <w:lang w:val="en-US"/>
       </w:rPr>
-      <w:t>nd</w:t>
+      <w:t>th</w:t>
     </w:r>
     <w:r>
       <w:rPr>
@@ -10056,7 +10159,7 @@
         <w:iCs/>
         <w:lang w:val="en-US"/>
       </w:rPr>
-      <w:t>December</w:t>
+      <w:t>February</w:t>
     </w:r>
     <w:r>
       <w:rPr>
@@ -10072,7 +10175,7 @@
         <w:iCs/>
         <w:lang w:val="en-US"/>
       </w:rPr>
-      <w:t>5</w:t>
+      <w:t>6</w:t>
     </w:r>
   </w:p>
 </w:ftr>

</xml_diff>